<commit_message>
Kalip listesi ve farklilastirma tablosu guncellendi: Bilgi Kosesi numaralari, 2.7 kart oyunu Sira Sizde'de, 2.14 projesi Performans Gorevi 2.2
</commit_message>
<xml_diff>
--- a/Formlar/Farklilastirma_kimya11.docx
+++ b/Formlar/Farklilastirma_kimya11.docx
@@ -1040,7 +1040,7 @@
                 <w:rFonts w:ascii="Times New Roman" w:hAnsi="Times New Roman" w:cs="Times New Roman"/>
                 <w:lang w:val="tr-TR"/>
               </w:rPr>
-              <w:t>Kim11.2.7’de Bilgi Köşesi olarak kart oyunu önerisi konuldu.</w:t>
+              <w:t>Kim11.2.7, Sıra Sizde 2.7.’nin 1. sorusu olarak kart oyunu etkinliği konuldu.</w:t>
             </w:r>
           </w:p>
         </w:tc>
@@ -1130,7 +1130,7 @@
                 <w:rFonts w:ascii="Times New Roman" w:hAnsi="Times New Roman" w:cs="Times New Roman"/>
                 <w:lang w:val="tr-TR"/>
               </w:rPr>
-              <w:t>Kim11.2.14’te Bilgi Köşesi’nde proje önerisi olarak konuldu.</w:t>
+              <w:t>Kim11.2.14’te Performans Görevi 2.2. (proje görevi) olarak konuldu.</w:t>
             </w:r>
           </w:p>
         </w:tc>
@@ -1220,7 +1220,7 @@
                 <w:rFonts w:ascii="Times New Roman" w:hAnsi="Times New Roman" w:cs="Times New Roman"/>
                 <w:lang w:val="tr-TR"/>
               </w:rPr>
-              <w:t>Kim11.2.14’te Bilgi Köşesi’nde proje önerisi olarak (gübre tuzlarının çözünürlüğü, CaCO_{3} ile toprak pH’ı) konuldu.</w:t>
+              <w:t>Kim11.2.14’te Performans Görevi 2.2. (proje görevi) içinde (gübre tuzlarının çözünürlüğü, CaCO_{3} ile toprak pH’ı) konuldu.</w:t>
             </w:r>
           </w:p>
         </w:tc>

</xml_diff>